<commit_message>
Updated Merger script to add Masakhaner detector and updated dispatcher script to a human in loop review system before redaction.
</commit_message>
<xml_diff>
--- a/tests/NigerianSamples/DOCX_Redaction_Test_redacted.docx
+++ b/tests/NigerianSamples/DOCX_Redaction_Test_redacted.docx
@@ -18,7 +18,7 @@
           <w:sz w:val="24"/>
           <w:szCs w:val="24"/>
         </w:rPr>
-        <w:t xml:space="preserve">However, the literature did not focus on accurately identifying and redacting sensitive information across diverse contexts. Current solutions largely rely on generalized datasets and models that are primarily optimized for regions such as [REDACTED], [REDACTED], and [REDACTED], leading to inconsistencies and biases in detecting Personally Identifiable Information (PII), especially names and identifiers [REDACTED] regions, [REDACTED] which shows significant improvement in different areas. to expand across sectors like government, healthcare, and finance, the risk of [REDACTED] [REDACTED] due to inefficient redaction tools becomes [REDACTED]. [REDACTED], which are largely optimized for regions such as [REDACTED], [REDACTED], and [REDACTED], fail to effectively recognize region-[REDACTED], resulting in inaccuracies and bias. By incorporating region-[REDACTED] context-aware models, the proposed system will improve the detection and redaction of sensitive information such as [REDACTED]n names with National Identification Number (NIN) of [REDACTED] and Social Security Number of [REDACTED]. </w:t>
+        <w:t xml:space="preserve">However, the literature did not focus on accurately identifying and redacting sensitive information across diverse contexts. Current solutions largely rely on generalized datasets and models that are primarily optimized for regions such as Europe, [REDACTED], and [REDACTED], leading to inconsistencies and biases in detecting Personally Identifiable Information (PII), especially names and identifiers from underrepresented regions, [REDACTED] which shows significant improvement in different areas. to expand across sectors like government, healthcare, and finance, the risk of exposing sensitive personal information due to inefficient redaction tools becomes increasingly critical. Existing solutions, which are largely optimized for regions such as Europe, [REDACTED], and [REDACTED], fail to effectively recognize region-specific identifiers, resulting in inaccuracies and bias. By incorporating region-specific datasets and context-aware models, the proposed system will improve the detection and redaction of sensitive information such as [REDACTED]n names with National Identification Number (NIN) of [REDACTED] and Social Security Number of [REDACTED]. </w:t>
       </w:r>
       <w:r>
         <w:rPr>
@@ -41,7 +41,7 @@
         <w:spacing w:line="360" w:lineRule="auto"/>
       </w:pPr>
       <w:r>
-        <w:t>This project focuses on the design and implementation of a smart [REDACTED] tool tailored to detect and redact sensitive information specific to underrepresented regions, [REDACTED]. The system will process digital text-based documents such as PDF and Word files [REDACTED] Number of [REDACTED] and address location of House [REDACTED], Alao-Akala Way, Akobo, [REDACTED], [REDACTED] State, [REDACTED].</w:t>
+        <w:t>This project focuses on the design and implementation of a smart document redaction tool tailored to detect and redact sensitive information specific to underrepresented regions, particularly [REDACTED]. The system will process digital text-based documents such as PDF and Word files with Bank Verification Number of [REDACTED] and address location of House [REDACTED], Alao-Akala Way, Akobo, [REDACTED], [REDACTED] State, [REDACTED].</w:t>
       </w:r>
       <w:r/>
       <w:r/>
@@ -52,7 +52,7 @@
         <w:spacing w:line="360" w:lineRule="auto"/>
       </w:pPr>
       <w:r>
-        <w:t>The modified system will be implemented as a desktop (PC-based) application, enabling users to locally upload and process documents without reliance on [REDACTED]. Performance evaluation will be conducted based on detection accuracy, processing efficiency, and the system’s effectiveness in [REDACTED] compared to existing generic redaction tools.</w:t>
+        <w:t>The modified system will be implemented as a desktop (PC-based) application, enabling users to locally upload and process documents without reliance on internet connectivity. Performance evaluation will be conducted based on detection accuracy, processing efficiency, and the system’s effectiveness in reducing regional bias compared to existing generic redaction tools.</w:t>
       </w:r>
     </w:p>
     <w:p>
@@ -179,7 +179,7 @@
               <w:jc w:val="center"/>
             </w:pPr>
             <w:r>
-              <w:t>Oladele [REDACTED]</w:t>
+              <w:t>[REDACTED]</w:t>
             </w:r>
           </w:p>
         </w:tc>

</xml_diff>